<commit_message>
added more to About page
</commit_message>
<xml_diff>
--- a/TEMP/My_Story.docx
+++ b/TEMP/My_Story.docx
@@ -57,6 +57,12 @@
       </w:r>
     </w:p>
     <w:p>
+      <w:pPr>
+        <w:rPr>
+          <w:b/>
+          <w:bCs/>
+        </w:rPr>
+      </w:pPr>
       <w:r>
         <w:rPr>
           <w:b/>
@@ -67,7 +73,26 @@
     </w:p>
     <w:p>
       <w:r>
-        <w:t>My goal isn't to tell people what to think. It's to help them understand their bodies, ask better questions, and make informed decisions that support long-term health.</w:t>
+        <w:t xml:space="preserve">Over the years, I've come to appreciate that information alone isn't enough. We live in a world overflowing with knowledge, yet knowledge by itself doesn't guarantee good decisions. I believe there is a God-given progression: </w:t>
+      </w:r>
+      <w:r>
+        <w:rPr>
+          <w:b/>
+          <w:bCs/>
+        </w:rPr>
+        <w:t>the fear of the Lord is the beginning of knowledge</w:t>
+      </w:r>
+      <w:r>
+        <w:t xml:space="preserve"> (Proverbs 1:7). Knowledge, when filtered through biblical truth, develops into discernment—the ability to distinguish truth from error, wisdom from cleverness, and evidence from speculation. Discernment, faithfully applied, grows into wisdom. And true wisdom isn't complete until it leads to obedience. Whether I'm studying nutrition, evaluating scientific research, exploring new technologies like artificial intelligence, or simply navigating everyday life, my desire is not merely to know more, but to grow in discernment, wisdom, and faithful obedience to God's Word.</w:t>
+      </w:r>
+    </w:p>
+    <w:p/>
+    <w:p>
+      <w:r>
+        <w:t>My goal isn't to tell people what to think. It's to help them ask better questions, evaluate the evidence with discernment, understand their bodies, and make informed decisions that support long-term health.</w:t>
+      </w:r>
+      <w:r>
+        <w:t xml:space="preserve">  </w:t>
       </w:r>
     </w:p>
     <w:p>
@@ -3228,139 +3253,12 @@
 </file>
 
 <file path=customXml/item1.xml><?xml version="1.0" encoding="utf-8"?>
-<p:properties xmlns:p="http://schemas.microsoft.com/office/2006/metadata/properties" xmlns:xsi="http://www.w3.org/2001/XMLSchema-instance" xmlns:pc="http://schemas.microsoft.com/office/infopath/2007/PartnerControls">
-  <documentManagement>
-    <LocLastLocAttemptVersionTypeLookup xmlns="4873beb7-5857-4685-be1f-d57550cc96cc" xsi:nil="true"/>
-    <MarketSpecific xmlns="4873beb7-5857-4685-be1f-d57550cc96cc">false</MarketSpecific>
-    <ApprovalStatus xmlns="4873beb7-5857-4685-be1f-d57550cc96cc">InProgress</ApprovalStatus>
-    <LocComments xmlns="4873beb7-5857-4685-be1f-d57550cc96cc" xsi:nil="true"/>
-    <DirectSourceMarket xmlns="4873beb7-5857-4685-be1f-d57550cc96cc" xsi:nil="true"/>
-    <LocPublishedLinkedAssetsLookup xmlns="4873beb7-5857-4685-be1f-d57550cc96cc" xsi:nil="true"/>
-    <ThumbnailAssetId xmlns="4873beb7-5857-4685-be1f-d57550cc96cc" xsi:nil="true"/>
-    <PrimaryImageGen xmlns="4873beb7-5857-4685-be1f-d57550cc96cc">true</PrimaryImageGen>
-    <LegacyData xmlns="4873beb7-5857-4685-be1f-d57550cc96cc" xsi:nil="true"/>
-    <LocNewPublishedVersionLookup xmlns="4873beb7-5857-4685-be1f-d57550cc96cc" xsi:nil="true"/>
-    <NumericId xmlns="4873beb7-5857-4685-be1f-d57550cc96cc">102787001</NumericId>
-    <TPFriendlyName xmlns="4873beb7-5857-4685-be1f-d57550cc96cc" xsi:nil="true"/>
-    <LocOverallPublishStatusLookup xmlns="4873beb7-5857-4685-be1f-d57550cc96cc" xsi:nil="true"/>
-    <LocRecommendedHandoff xmlns="4873beb7-5857-4685-be1f-d57550cc96cc" xsi:nil="true"/>
-    <BlockPublish xmlns="4873beb7-5857-4685-be1f-d57550cc96cc">false</BlockPublish>
-    <BusinessGroup xmlns="4873beb7-5857-4685-be1f-d57550cc96cc" xsi:nil="true"/>
-    <OpenTemplate xmlns="4873beb7-5857-4685-be1f-d57550cc96cc">true</OpenTemplate>
-    <SourceTitle xmlns="4873beb7-5857-4685-be1f-d57550cc96cc" xsi:nil="true"/>
-    <LocOverallLocStatusLookup xmlns="4873beb7-5857-4685-be1f-d57550cc96cc" xsi:nil="true"/>
-    <APEditor xmlns="4873beb7-5857-4685-be1f-d57550cc96cc">
-      <UserInfo>
-        <DisplayName/>
-        <AccountId xsi:nil="true"/>
-        <AccountType/>
-      </UserInfo>
-    </APEditor>
-    <UALocComments xmlns="4873beb7-5857-4685-be1f-d57550cc96cc" xsi:nil="true"/>
-    <IntlLangReviewDate xmlns="4873beb7-5857-4685-be1f-d57550cc96cc" xsi:nil="true"/>
-    <PublishStatusLookup xmlns="4873beb7-5857-4685-be1f-d57550cc96cc">
-      <Value>1343188</Value>
-    </PublishStatusLookup>
-    <ParentAssetId xmlns="4873beb7-5857-4685-be1f-d57550cc96cc" xsi:nil="true"/>
-    <FeatureTagsTaxHTField0 xmlns="4873beb7-5857-4685-be1f-d57550cc96cc">
-      <Terms xmlns="http://schemas.microsoft.com/office/infopath/2007/PartnerControls"/>
-    </FeatureTagsTaxHTField0>
-    <MachineTranslated xmlns="4873beb7-5857-4685-be1f-d57550cc96cc">false</MachineTranslated>
-    <Providers xmlns="4873beb7-5857-4685-be1f-d57550cc96cc" xsi:nil="true"/>
-    <OriginalSourceMarket xmlns="4873beb7-5857-4685-be1f-d57550cc96cc" xsi:nil="true"/>
-    <APDescription xmlns="4873beb7-5857-4685-be1f-d57550cc96cc" xsi:nil="true"/>
-    <ContentItem xmlns="4873beb7-5857-4685-be1f-d57550cc96cc" xsi:nil="true"/>
-    <ClipArtFilename xmlns="4873beb7-5857-4685-be1f-d57550cc96cc" xsi:nil="true"/>
-    <TPInstallLocation xmlns="4873beb7-5857-4685-be1f-d57550cc96cc" xsi:nil="true"/>
-    <TimesCloned xmlns="4873beb7-5857-4685-be1f-d57550cc96cc" xsi:nil="true"/>
-    <PublishTargets xmlns="4873beb7-5857-4685-be1f-d57550cc96cc">OfficeOnlineVNext</PublishTargets>
-    <AcquiredFrom xmlns="4873beb7-5857-4685-be1f-d57550cc96cc">Internal MS</AcquiredFrom>
-    <AssetStart xmlns="4873beb7-5857-4685-be1f-d57550cc96cc">2011-11-23T17:29:00+00:00</AssetStart>
-    <FriendlyTitle xmlns="4873beb7-5857-4685-be1f-d57550cc96cc" xsi:nil="true"/>
-    <Provider xmlns="4873beb7-5857-4685-be1f-d57550cc96cc" xsi:nil="true"/>
-    <LastHandOff xmlns="4873beb7-5857-4685-be1f-d57550cc96cc" xsi:nil="true"/>
-    <TPClientViewer xmlns="4873beb7-5857-4685-be1f-d57550cc96cc" xsi:nil="true"/>
-    <TemplateStatus xmlns="4873beb7-5857-4685-be1f-d57550cc96cc">Complete</TemplateStatus>
-    <Downloads xmlns="4873beb7-5857-4685-be1f-d57550cc96cc">0</Downloads>
-    <OOCacheId xmlns="4873beb7-5857-4685-be1f-d57550cc96cc" xsi:nil="true"/>
-    <IsDeleted xmlns="4873beb7-5857-4685-be1f-d57550cc96cc">false</IsDeleted>
-    <LocPublishedDependentAssetsLookup xmlns="4873beb7-5857-4685-be1f-d57550cc96cc" xsi:nil="true"/>
-    <AssetExpire xmlns="4873beb7-5857-4685-be1f-d57550cc96cc">2029-05-12T07:00:00+00:00</AssetExpire>
-    <CSXSubmissionMarket xmlns="4873beb7-5857-4685-be1f-d57550cc96cc" xsi:nil="true"/>
-    <DSATActionTaken xmlns="4873beb7-5857-4685-be1f-d57550cc96cc" xsi:nil="true"/>
-    <SubmitterId xmlns="4873beb7-5857-4685-be1f-d57550cc96cc" xsi:nil="true"/>
-    <EditorialTags xmlns="4873beb7-5857-4685-be1f-d57550cc96cc" xsi:nil="true"/>
-    <TPExecutable xmlns="4873beb7-5857-4685-be1f-d57550cc96cc" xsi:nil="true"/>
-    <CSXSubmissionDate xmlns="4873beb7-5857-4685-be1f-d57550cc96cc" xsi:nil="true"/>
-    <CSXUpdate xmlns="4873beb7-5857-4685-be1f-d57550cc96cc">false</CSXUpdate>
-    <AssetType xmlns="4873beb7-5857-4685-be1f-d57550cc96cc">TP</AssetType>
-    <ApprovalLog xmlns="4873beb7-5857-4685-be1f-d57550cc96cc" xsi:nil="true"/>
-    <BugNumber xmlns="4873beb7-5857-4685-be1f-d57550cc96cc" xsi:nil="true"/>
-    <OriginAsset xmlns="4873beb7-5857-4685-be1f-d57550cc96cc" xsi:nil="true"/>
-    <TPComponent xmlns="4873beb7-5857-4685-be1f-d57550cc96cc" xsi:nil="true"/>
-    <Milestone xmlns="4873beb7-5857-4685-be1f-d57550cc96cc" xsi:nil="true"/>
-    <RecommendationsModifier xmlns="4873beb7-5857-4685-be1f-d57550cc96cc" xsi:nil="true"/>
-    <AssetId xmlns="4873beb7-5857-4685-be1f-d57550cc96cc">TP102787001</AssetId>
-    <PolicheckWords xmlns="4873beb7-5857-4685-be1f-d57550cc96cc" xsi:nil="true"/>
-    <TPLaunchHelpLink xmlns="4873beb7-5857-4685-be1f-d57550cc96cc" xsi:nil="true"/>
-    <IntlLocPriority xmlns="4873beb7-5857-4685-be1f-d57550cc96cc" xsi:nil="true"/>
-    <TPApplication xmlns="4873beb7-5857-4685-be1f-d57550cc96cc" xsi:nil="true"/>
-    <IntlLangReviewer xmlns="4873beb7-5857-4685-be1f-d57550cc96cc" xsi:nil="true"/>
-    <HandoffToMSDN xmlns="4873beb7-5857-4685-be1f-d57550cc96cc" xsi:nil="true"/>
-    <PlannedPubDate xmlns="4873beb7-5857-4685-be1f-d57550cc96cc" xsi:nil="true"/>
-    <CrawlForDependencies xmlns="4873beb7-5857-4685-be1f-d57550cc96cc">false</CrawlForDependencies>
-    <LocLastLocAttemptVersionLookup xmlns="4873beb7-5857-4685-be1f-d57550cc96cc">693888</LocLastLocAttemptVersionLookup>
-    <LocProcessedForHandoffsLookup xmlns="4873beb7-5857-4685-be1f-d57550cc96cc" xsi:nil="true"/>
-    <TrustLevel xmlns="4873beb7-5857-4685-be1f-d57550cc96cc">1 Microsoft Managed Content</TrustLevel>
-    <CampaignTagsTaxHTField0 xmlns="4873beb7-5857-4685-be1f-d57550cc96cc">
-      <Terms xmlns="http://schemas.microsoft.com/office/infopath/2007/PartnerControls"/>
-    </CampaignTagsTaxHTField0>
-    <TPNamespace xmlns="4873beb7-5857-4685-be1f-d57550cc96cc" xsi:nil="true"/>
-    <LocOverallPreviewStatusLookup xmlns="4873beb7-5857-4685-be1f-d57550cc96cc" xsi:nil="true"/>
-    <TaxCatchAll xmlns="4873beb7-5857-4685-be1f-d57550cc96cc"/>
-    <IsSearchable xmlns="4873beb7-5857-4685-be1f-d57550cc96cc">false</IsSearchable>
-    <TemplateTemplateType xmlns="4873beb7-5857-4685-be1f-d57550cc96cc">Word Document Template</TemplateTemplateType>
-    <Markets xmlns="4873beb7-5857-4685-be1f-d57550cc96cc"/>
-    <IntlLangReview xmlns="4873beb7-5857-4685-be1f-d57550cc96cc" xsi:nil="true"/>
-    <UAProjectedTotalWords xmlns="4873beb7-5857-4685-be1f-d57550cc96cc" xsi:nil="true"/>
-    <OutputCachingOn xmlns="4873beb7-5857-4685-be1f-d57550cc96cc">false</OutputCachingOn>
-    <AverageRating xmlns="4873beb7-5857-4685-be1f-d57550cc96cc" xsi:nil="true"/>
-    <LocMarketGroupTiers2 xmlns="4873beb7-5857-4685-be1f-d57550cc96cc" xsi:nil="true"/>
-    <APAuthor xmlns="4873beb7-5857-4685-be1f-d57550cc96cc">
-      <UserInfo>
-        <DisplayName>REDMOND\v-namall</DisplayName>
-        <AccountId>978</AccountId>
-        <AccountType/>
-      </UserInfo>
-    </APAuthor>
-    <TPCommandLine xmlns="4873beb7-5857-4685-be1f-d57550cc96cc" xsi:nil="true"/>
-    <LocManualTestRequired xmlns="4873beb7-5857-4685-be1f-d57550cc96cc">false</LocManualTestRequired>
-    <TPAppVersion xmlns="4873beb7-5857-4685-be1f-d57550cc96cc" xsi:nil="true"/>
-    <EditorialStatus xmlns="4873beb7-5857-4685-be1f-d57550cc96cc">Complete</EditorialStatus>
-    <LocProcessedForMarketsLookup xmlns="4873beb7-5857-4685-be1f-d57550cc96cc" xsi:nil="true"/>
-    <LastModifiedDateTime xmlns="4873beb7-5857-4685-be1f-d57550cc96cc" xsi:nil="true"/>
-    <TPLaunchHelpLinkType xmlns="4873beb7-5857-4685-be1f-d57550cc96cc">Template</TPLaunchHelpLinkType>
-    <ScenarioTagsTaxHTField0 xmlns="4873beb7-5857-4685-be1f-d57550cc96cc">
-      <Terms xmlns="http://schemas.microsoft.com/office/infopath/2007/PartnerControls"/>
-    </ScenarioTagsTaxHTField0>
-    <OriginalRelease xmlns="4873beb7-5857-4685-be1f-d57550cc96cc">14</OriginalRelease>
-    <LocalizationTagsTaxHTField0 xmlns="4873beb7-5857-4685-be1f-d57550cc96cc">
-      <Terms xmlns="http://schemas.microsoft.com/office/infopath/2007/PartnerControls"/>
-    </LocalizationTagsTaxHTField0>
-    <Manager xmlns="4873beb7-5857-4685-be1f-d57550cc96cc" xsi:nil="true"/>
-    <UALocRecommendation xmlns="4873beb7-5857-4685-be1f-d57550cc96cc">Localize</UALocRecommendation>
-    <LocOverallHandbackStatusLookup xmlns="4873beb7-5857-4685-be1f-d57550cc96cc" xsi:nil="true"/>
-    <ArtSampleDocs xmlns="4873beb7-5857-4685-be1f-d57550cc96cc" xsi:nil="true"/>
-    <UACurrentWords xmlns="4873beb7-5857-4685-be1f-d57550cc96cc" xsi:nil="true"/>
-    <ShowIn xmlns="4873beb7-5857-4685-be1f-d57550cc96cc">Show everywhere</ShowIn>
-    <CSXHash xmlns="4873beb7-5857-4685-be1f-d57550cc96cc" xsi:nil="true"/>
-    <VoteCount xmlns="4873beb7-5857-4685-be1f-d57550cc96cc" xsi:nil="true"/>
-    <InternalTagsTaxHTField0 xmlns="4873beb7-5857-4685-be1f-d57550cc96cc">
-      <Terms xmlns="http://schemas.microsoft.com/office/infopath/2007/PartnerControls"/>
-    </InternalTagsTaxHTField0>
-    <UANotes xmlns="4873beb7-5857-4685-be1f-d57550cc96cc" xsi:nil="true"/>
-  </documentManagement>
-</p:properties>
+<?mso-contentType ?>
+<FormTemplates xmlns="http://schemas.microsoft.com/sharepoint/v3/contenttype/forms">
+  <Display>DocumentLibraryForm</Display>
+  <Edit>AssetEditForm</Edit>
+  <New>DocumentLibraryForm</New>
+</FormTemplates>
 </file>
 
 <file path=customXml/item2.xml><?xml version="1.0" encoding="utf-8"?>
@@ -4404,20 +4302,145 @@
 </file>
 
 <file path=customXml/item3.xml><?xml version="1.0" encoding="utf-8"?>
-<?mso-contentType ?>
-<FormTemplates xmlns="http://schemas.microsoft.com/sharepoint/v3/contenttype/forms">
-  <Display>DocumentLibraryForm</Display>
-  <Edit>AssetEditForm</Edit>
-  <New>DocumentLibraryForm</New>
-</FormTemplates>
+<p:properties xmlns:p="http://schemas.microsoft.com/office/2006/metadata/properties" xmlns:xsi="http://www.w3.org/2001/XMLSchema-instance" xmlns:pc="http://schemas.microsoft.com/office/infopath/2007/PartnerControls">
+  <documentManagement>
+    <LocLastLocAttemptVersionTypeLookup xmlns="4873beb7-5857-4685-be1f-d57550cc96cc" xsi:nil="true"/>
+    <MarketSpecific xmlns="4873beb7-5857-4685-be1f-d57550cc96cc">false</MarketSpecific>
+    <ApprovalStatus xmlns="4873beb7-5857-4685-be1f-d57550cc96cc">InProgress</ApprovalStatus>
+    <LocComments xmlns="4873beb7-5857-4685-be1f-d57550cc96cc" xsi:nil="true"/>
+    <DirectSourceMarket xmlns="4873beb7-5857-4685-be1f-d57550cc96cc" xsi:nil="true"/>
+    <LocPublishedLinkedAssetsLookup xmlns="4873beb7-5857-4685-be1f-d57550cc96cc" xsi:nil="true"/>
+    <ThumbnailAssetId xmlns="4873beb7-5857-4685-be1f-d57550cc96cc" xsi:nil="true"/>
+    <PrimaryImageGen xmlns="4873beb7-5857-4685-be1f-d57550cc96cc">true</PrimaryImageGen>
+    <LegacyData xmlns="4873beb7-5857-4685-be1f-d57550cc96cc" xsi:nil="true"/>
+    <LocNewPublishedVersionLookup xmlns="4873beb7-5857-4685-be1f-d57550cc96cc" xsi:nil="true"/>
+    <NumericId xmlns="4873beb7-5857-4685-be1f-d57550cc96cc">102787001</NumericId>
+    <TPFriendlyName xmlns="4873beb7-5857-4685-be1f-d57550cc96cc" xsi:nil="true"/>
+    <LocOverallPublishStatusLookup xmlns="4873beb7-5857-4685-be1f-d57550cc96cc" xsi:nil="true"/>
+    <LocRecommendedHandoff xmlns="4873beb7-5857-4685-be1f-d57550cc96cc" xsi:nil="true"/>
+    <BlockPublish xmlns="4873beb7-5857-4685-be1f-d57550cc96cc">false</BlockPublish>
+    <BusinessGroup xmlns="4873beb7-5857-4685-be1f-d57550cc96cc" xsi:nil="true"/>
+    <OpenTemplate xmlns="4873beb7-5857-4685-be1f-d57550cc96cc">true</OpenTemplate>
+    <SourceTitle xmlns="4873beb7-5857-4685-be1f-d57550cc96cc" xsi:nil="true"/>
+    <LocOverallLocStatusLookup xmlns="4873beb7-5857-4685-be1f-d57550cc96cc" xsi:nil="true"/>
+    <APEditor xmlns="4873beb7-5857-4685-be1f-d57550cc96cc">
+      <UserInfo>
+        <DisplayName/>
+        <AccountId xsi:nil="true"/>
+        <AccountType/>
+      </UserInfo>
+    </APEditor>
+    <UALocComments xmlns="4873beb7-5857-4685-be1f-d57550cc96cc" xsi:nil="true"/>
+    <IntlLangReviewDate xmlns="4873beb7-5857-4685-be1f-d57550cc96cc" xsi:nil="true"/>
+    <PublishStatusLookup xmlns="4873beb7-5857-4685-be1f-d57550cc96cc">
+      <Value>1343188</Value>
+    </PublishStatusLookup>
+    <ParentAssetId xmlns="4873beb7-5857-4685-be1f-d57550cc96cc" xsi:nil="true"/>
+    <FeatureTagsTaxHTField0 xmlns="4873beb7-5857-4685-be1f-d57550cc96cc">
+      <Terms xmlns="http://schemas.microsoft.com/office/infopath/2007/PartnerControls"/>
+    </FeatureTagsTaxHTField0>
+    <MachineTranslated xmlns="4873beb7-5857-4685-be1f-d57550cc96cc">false</MachineTranslated>
+    <Providers xmlns="4873beb7-5857-4685-be1f-d57550cc96cc" xsi:nil="true"/>
+    <OriginalSourceMarket xmlns="4873beb7-5857-4685-be1f-d57550cc96cc" xsi:nil="true"/>
+    <APDescription xmlns="4873beb7-5857-4685-be1f-d57550cc96cc" xsi:nil="true"/>
+    <ContentItem xmlns="4873beb7-5857-4685-be1f-d57550cc96cc" xsi:nil="true"/>
+    <ClipArtFilename xmlns="4873beb7-5857-4685-be1f-d57550cc96cc" xsi:nil="true"/>
+    <TPInstallLocation xmlns="4873beb7-5857-4685-be1f-d57550cc96cc" xsi:nil="true"/>
+    <TimesCloned xmlns="4873beb7-5857-4685-be1f-d57550cc96cc" xsi:nil="true"/>
+    <PublishTargets xmlns="4873beb7-5857-4685-be1f-d57550cc96cc">OfficeOnlineVNext</PublishTargets>
+    <AcquiredFrom xmlns="4873beb7-5857-4685-be1f-d57550cc96cc">Internal MS</AcquiredFrom>
+    <AssetStart xmlns="4873beb7-5857-4685-be1f-d57550cc96cc">2011-11-23T17:29:00+00:00</AssetStart>
+    <FriendlyTitle xmlns="4873beb7-5857-4685-be1f-d57550cc96cc" xsi:nil="true"/>
+    <Provider xmlns="4873beb7-5857-4685-be1f-d57550cc96cc" xsi:nil="true"/>
+    <LastHandOff xmlns="4873beb7-5857-4685-be1f-d57550cc96cc" xsi:nil="true"/>
+    <TPClientViewer xmlns="4873beb7-5857-4685-be1f-d57550cc96cc" xsi:nil="true"/>
+    <TemplateStatus xmlns="4873beb7-5857-4685-be1f-d57550cc96cc">Complete</TemplateStatus>
+    <Downloads xmlns="4873beb7-5857-4685-be1f-d57550cc96cc">0</Downloads>
+    <OOCacheId xmlns="4873beb7-5857-4685-be1f-d57550cc96cc" xsi:nil="true"/>
+    <IsDeleted xmlns="4873beb7-5857-4685-be1f-d57550cc96cc">false</IsDeleted>
+    <LocPublishedDependentAssetsLookup xmlns="4873beb7-5857-4685-be1f-d57550cc96cc" xsi:nil="true"/>
+    <AssetExpire xmlns="4873beb7-5857-4685-be1f-d57550cc96cc">2029-05-12T07:00:00+00:00</AssetExpire>
+    <CSXSubmissionMarket xmlns="4873beb7-5857-4685-be1f-d57550cc96cc" xsi:nil="true"/>
+    <DSATActionTaken xmlns="4873beb7-5857-4685-be1f-d57550cc96cc" xsi:nil="true"/>
+    <SubmitterId xmlns="4873beb7-5857-4685-be1f-d57550cc96cc" xsi:nil="true"/>
+    <EditorialTags xmlns="4873beb7-5857-4685-be1f-d57550cc96cc" xsi:nil="true"/>
+    <TPExecutable xmlns="4873beb7-5857-4685-be1f-d57550cc96cc" xsi:nil="true"/>
+    <CSXSubmissionDate xmlns="4873beb7-5857-4685-be1f-d57550cc96cc" xsi:nil="true"/>
+    <CSXUpdate xmlns="4873beb7-5857-4685-be1f-d57550cc96cc">false</CSXUpdate>
+    <AssetType xmlns="4873beb7-5857-4685-be1f-d57550cc96cc">TP</AssetType>
+    <ApprovalLog xmlns="4873beb7-5857-4685-be1f-d57550cc96cc" xsi:nil="true"/>
+    <BugNumber xmlns="4873beb7-5857-4685-be1f-d57550cc96cc" xsi:nil="true"/>
+    <OriginAsset xmlns="4873beb7-5857-4685-be1f-d57550cc96cc" xsi:nil="true"/>
+    <TPComponent xmlns="4873beb7-5857-4685-be1f-d57550cc96cc" xsi:nil="true"/>
+    <Milestone xmlns="4873beb7-5857-4685-be1f-d57550cc96cc" xsi:nil="true"/>
+    <RecommendationsModifier xmlns="4873beb7-5857-4685-be1f-d57550cc96cc" xsi:nil="true"/>
+    <AssetId xmlns="4873beb7-5857-4685-be1f-d57550cc96cc">TP102787001</AssetId>
+    <PolicheckWords xmlns="4873beb7-5857-4685-be1f-d57550cc96cc" xsi:nil="true"/>
+    <TPLaunchHelpLink xmlns="4873beb7-5857-4685-be1f-d57550cc96cc" xsi:nil="true"/>
+    <IntlLocPriority xmlns="4873beb7-5857-4685-be1f-d57550cc96cc" xsi:nil="true"/>
+    <TPApplication xmlns="4873beb7-5857-4685-be1f-d57550cc96cc" xsi:nil="true"/>
+    <IntlLangReviewer xmlns="4873beb7-5857-4685-be1f-d57550cc96cc" xsi:nil="true"/>
+    <HandoffToMSDN xmlns="4873beb7-5857-4685-be1f-d57550cc96cc" xsi:nil="true"/>
+    <PlannedPubDate xmlns="4873beb7-5857-4685-be1f-d57550cc96cc" xsi:nil="true"/>
+    <CrawlForDependencies xmlns="4873beb7-5857-4685-be1f-d57550cc96cc">false</CrawlForDependencies>
+    <LocLastLocAttemptVersionLookup xmlns="4873beb7-5857-4685-be1f-d57550cc96cc">693888</LocLastLocAttemptVersionLookup>
+    <LocProcessedForHandoffsLookup xmlns="4873beb7-5857-4685-be1f-d57550cc96cc" xsi:nil="true"/>
+    <TrustLevel xmlns="4873beb7-5857-4685-be1f-d57550cc96cc">1 Microsoft Managed Content</TrustLevel>
+    <CampaignTagsTaxHTField0 xmlns="4873beb7-5857-4685-be1f-d57550cc96cc">
+      <Terms xmlns="http://schemas.microsoft.com/office/infopath/2007/PartnerControls"/>
+    </CampaignTagsTaxHTField0>
+    <TPNamespace xmlns="4873beb7-5857-4685-be1f-d57550cc96cc" xsi:nil="true"/>
+    <LocOverallPreviewStatusLookup xmlns="4873beb7-5857-4685-be1f-d57550cc96cc" xsi:nil="true"/>
+    <TaxCatchAll xmlns="4873beb7-5857-4685-be1f-d57550cc96cc"/>
+    <IsSearchable xmlns="4873beb7-5857-4685-be1f-d57550cc96cc">false</IsSearchable>
+    <TemplateTemplateType xmlns="4873beb7-5857-4685-be1f-d57550cc96cc">Word Document Template</TemplateTemplateType>
+    <Markets xmlns="4873beb7-5857-4685-be1f-d57550cc96cc"/>
+    <IntlLangReview xmlns="4873beb7-5857-4685-be1f-d57550cc96cc" xsi:nil="true"/>
+    <UAProjectedTotalWords xmlns="4873beb7-5857-4685-be1f-d57550cc96cc" xsi:nil="true"/>
+    <OutputCachingOn xmlns="4873beb7-5857-4685-be1f-d57550cc96cc">false</OutputCachingOn>
+    <AverageRating xmlns="4873beb7-5857-4685-be1f-d57550cc96cc" xsi:nil="true"/>
+    <LocMarketGroupTiers2 xmlns="4873beb7-5857-4685-be1f-d57550cc96cc" xsi:nil="true"/>
+    <APAuthor xmlns="4873beb7-5857-4685-be1f-d57550cc96cc">
+      <UserInfo>
+        <DisplayName>REDMOND\v-namall</DisplayName>
+        <AccountId>978</AccountId>
+        <AccountType/>
+      </UserInfo>
+    </APAuthor>
+    <TPCommandLine xmlns="4873beb7-5857-4685-be1f-d57550cc96cc" xsi:nil="true"/>
+    <LocManualTestRequired xmlns="4873beb7-5857-4685-be1f-d57550cc96cc">false</LocManualTestRequired>
+    <TPAppVersion xmlns="4873beb7-5857-4685-be1f-d57550cc96cc" xsi:nil="true"/>
+    <EditorialStatus xmlns="4873beb7-5857-4685-be1f-d57550cc96cc">Complete</EditorialStatus>
+    <LocProcessedForMarketsLookup xmlns="4873beb7-5857-4685-be1f-d57550cc96cc" xsi:nil="true"/>
+    <LastModifiedDateTime xmlns="4873beb7-5857-4685-be1f-d57550cc96cc" xsi:nil="true"/>
+    <TPLaunchHelpLinkType xmlns="4873beb7-5857-4685-be1f-d57550cc96cc">Template</TPLaunchHelpLinkType>
+    <ScenarioTagsTaxHTField0 xmlns="4873beb7-5857-4685-be1f-d57550cc96cc">
+      <Terms xmlns="http://schemas.microsoft.com/office/infopath/2007/PartnerControls"/>
+    </ScenarioTagsTaxHTField0>
+    <OriginalRelease xmlns="4873beb7-5857-4685-be1f-d57550cc96cc">14</OriginalRelease>
+    <LocalizationTagsTaxHTField0 xmlns="4873beb7-5857-4685-be1f-d57550cc96cc">
+      <Terms xmlns="http://schemas.microsoft.com/office/infopath/2007/PartnerControls"/>
+    </LocalizationTagsTaxHTField0>
+    <Manager xmlns="4873beb7-5857-4685-be1f-d57550cc96cc" xsi:nil="true"/>
+    <UALocRecommendation xmlns="4873beb7-5857-4685-be1f-d57550cc96cc">Localize</UALocRecommendation>
+    <LocOverallHandbackStatusLookup xmlns="4873beb7-5857-4685-be1f-d57550cc96cc" xsi:nil="true"/>
+    <ArtSampleDocs xmlns="4873beb7-5857-4685-be1f-d57550cc96cc" xsi:nil="true"/>
+    <UACurrentWords xmlns="4873beb7-5857-4685-be1f-d57550cc96cc" xsi:nil="true"/>
+    <ShowIn xmlns="4873beb7-5857-4685-be1f-d57550cc96cc">Show everywhere</ShowIn>
+    <CSXHash xmlns="4873beb7-5857-4685-be1f-d57550cc96cc" xsi:nil="true"/>
+    <VoteCount xmlns="4873beb7-5857-4685-be1f-d57550cc96cc" xsi:nil="true"/>
+    <InternalTagsTaxHTField0 xmlns="4873beb7-5857-4685-be1f-d57550cc96cc">
+      <Terms xmlns="http://schemas.microsoft.com/office/infopath/2007/PartnerControls"/>
+    </InternalTagsTaxHTField0>
+    <UANotes xmlns="4873beb7-5857-4685-be1f-d57550cc96cc" xsi:nil="true"/>
+  </documentManagement>
+</p:properties>
 </file>
 
 <file path=customXml/itemProps1.xml><?xml version="1.0" encoding="utf-8"?>
-<ds:datastoreItem xmlns:ds="http://schemas.openxmlformats.org/officeDocument/2006/customXml" ds:itemID="{7FBDB1CC-CEFB-4E46-8174-1F0AA0D30B24}">
+<ds:datastoreItem xmlns:ds="http://schemas.openxmlformats.org/officeDocument/2006/customXml" ds:itemID="{C01C3C56-10DB-49F7-B061-44D8728D078A}">
   <ds:schemaRefs>
-    <ds:schemaRef ds:uri="http://schemas.microsoft.com/office/2006/metadata/properties"/>
-    <ds:schemaRef ds:uri="http://schemas.microsoft.com/office/infopath/2007/PartnerControls"/>
-    <ds:schemaRef ds:uri="4873beb7-5857-4685-be1f-d57550cc96cc"/>
+    <ds:schemaRef ds:uri="http://schemas.microsoft.com/sharepoint/v3/contenttype/forms"/>
   </ds:schemaRefs>
 </ds:datastoreItem>
 </file>
@@ -4441,9 +4464,11 @@
 </file>
 
 <file path=customXml/itemProps3.xml><?xml version="1.0" encoding="utf-8"?>
-<ds:datastoreItem xmlns:ds="http://schemas.openxmlformats.org/officeDocument/2006/customXml" ds:itemID="{C01C3C56-10DB-49F7-B061-44D8728D078A}">
+<ds:datastoreItem xmlns:ds="http://schemas.openxmlformats.org/officeDocument/2006/customXml" ds:itemID="{7FBDB1CC-CEFB-4E46-8174-1F0AA0D30B24}">
   <ds:schemaRefs>
-    <ds:schemaRef ds:uri="http://schemas.microsoft.com/sharepoint/v3/contenttype/forms"/>
+    <ds:schemaRef ds:uri="http://schemas.microsoft.com/office/2006/metadata/properties"/>
+    <ds:schemaRef ds:uri="http://schemas.microsoft.com/office/infopath/2007/PartnerControls"/>
+    <ds:schemaRef ds:uri="4873beb7-5857-4685-be1f-d57550cc96cc"/>
   </ds:schemaRefs>
 </ds:datastoreItem>
 </file>
</xml_diff>